<commit_message>
feat(word): beautify tech deep-dive docx · 升级 H1/H2/H3(底色+边框+字号) + 加页眉页脚(文档标题+页码) + 升级 SourceCode 样式(等宽字体+浅灰底) + 加 CalloutBox + TableGrid 首行蓝色表头 + A4 标准页边距 — 55729→55901 bytes
</commit_message>
<xml_diff>
--- a/word/2026-06-05-1658-aigw-tech-deepdive-article.docx
+++ b/word/2026-06-05-1658-aigw-tech-deepdive-article.docx
@@ -32158,7 +32158,14 @@
     </w:p>
     <w:bookmarkEnd w:id="102"/>
     <w:bookmarkEnd w:id="103"/>
-    <w:sectPr/>
+    <w:sectPr>
+      <w:headerReference w:type="default" r:id="rId10"/>
+      <w:footerReference w:type="default" r:id="rId11"/>
+      <w:pgSz w:w="11906" w:h="16838"/>
+      <w:pgMar w:top="1440" w:right="1418" w:bottom="1440" w:left="1418" w:header="720" w:footer="720" w:gutter="0"/>
+      <w:cols w:space="708"/>
+      <w:docGrid w:linePitch="360"/>
+    </w:sectPr>
   </w:body>
 </w:document>
 </file>
@@ -32168,6 +32175,12 @@
 </w:comments>
 </file>
 
+<file path=word/footer1.xml><?xml version="1.0" encoding="UTF-8" standalone="yes"?>
+<w:ftr xmlns:w="http://schemas.openxmlformats.org/wordprocessingml/2006/main">
+<w:p><w:pPr><w:pBdr><w:top w:val="single" w:sz="4" w:space="2" w:color="BFBFBF"/></w:pBdr><w:tabs><w:tab w:val="center" w:pos="4500"/><w:tab w:val="right" w:pos="9000"/></w:tabs><w:spacing w:before="40"/><w:rPr><w:rFonts w:ascii="Calibri" w:eastAsia="Microsoft YaHei" w:hAnsi="Calibri"/><w:color w:val="808080"/><w:sz w:val="18"/><w:szCs w:val="18"/></w:rPr></w:pPr><w:r><w:rPr><w:rFonts w:ascii="Calibri" w:eastAsia="Microsoft YaHei" w:hAnsi="Calibri"/><w:color w:val="808080"/><w:sz w:val="18"/><w:szCs w:val="18"/></w:rPr><w:t xml:space="preserve">完稿 2026-06-05</w:t></w:r><w:r><w:rPr><w:rFonts w:ascii="Calibri" w:eastAsia="Microsoft YaHei" w:hAnsi="Calibri"/><w:color w:val="808080"/><w:sz w:val="18"/><w:szCs w:val="18"/></w:rPr><w:tab/></w:r><w:r><w:rPr><w:rFonts w:ascii="Calibri" w:eastAsia="Microsoft YaHei" w:hAnsi="Calibri"/><w:color w:val="808080"/><w:sz w:val="18"/><w:szCs w:val="18"/></w:rPr><w:t xml:space="preserve">第 </w:t></w:r><w:fldChar w:fldCharType="begin"/></w:r><w:r><w:rPr><w:rFonts w:ascii="Calibri" w:eastAsia="Microsoft YaHei" w:hAnsi="Calibri"/><w:color w:val="808080"/><w:sz w:val="18"/><w:szCs w:val="18"/></w:rPr><w:instrText xml:space="preserve"> PAGE </w:instrText></w:r><w:fldChar w:fldCharType="separate"/></w:r><w:r><w:rPr><w:rFonts w:ascii="Calibri" w:eastAsia="Microsoft YaHei" w:hAnsi="Calibri"/><w:color w:val="808080"/><w:sz w:val="18"/><w:szCs w:val="18"/></w:rPr><w:t>1</w:t></w:r><w:fldChar w:fldCharType="end"/></w:r><w:r><w:rPr><w:rFonts w:ascii="Calibri" w:eastAsia="Microsoft YaHei" w:hAnsi="Calibri"/><w:color w:val="808080"/><w:sz w:val="18"/><w:szCs w:val="18"/></w:rPr><w:t xml:space="preserve"> 页 / 共 </w:t></w:r><w:fldChar w:fldCharType="begin"/></w:r><w:r><w:rPr><w:rFonts w:ascii="Calibri" w:eastAsia="Microsoft YaHei" w:hAnsi="Calibri"/><w:color w:val="808080"/><w:sz w:val="18"/><w:szCs w:val="18"/></w:rPr><w:instrText xml:space="preserve"> NUMPAGES </w:instrText></w:r><w:fldChar w:fldCharType="separate"/></w:r><w:r><w:rPr><w:rFonts w:ascii="Calibri" w:eastAsia="Microsoft YaHei" w:hAnsi="Calibri"/><w:color w:val="808080"/><w:sz w:val="18"/><w:szCs w:val="18"/></w:rPr><w:t>1</w:t></w:r><w:fldChar w:fldCharType="end"/></w:r><w:r><w:rPr><w:rFonts w:ascii="Calibri" w:eastAsia="Microsoft YaHei" w:hAnsi="Calibri"/><w:color w:val="808080"/><w:sz w:val="18"/><w:szCs w:val="18"/></w:rPr><w:t xml:space="preserve"> 页</w:t></w:r><w:r><w:rPr><w:rFonts w:ascii="Calibri" w:eastAsia="Microsoft YaHei" w:hAnsi="Calibri"/><w:color w:val="808080"/><w:sz w:val="18"/><w:szCs w:val="18"/></w:rPr><w:tab/></w:r><w:r><w:rPr><w:rFonts w:ascii="Calibri" w:eastAsia="Microsoft YaHei" w:hAnsi="Calibri"/><w:i/><w:color w:val="808080"/><w:sz w:val="18"/><w:szCs w:val="18"/></w:rPr><w:t xml:space="preserve">happysunxf/aigw</w:t></w:r></w:p>
+</w:ftr>
+</file>
+
 <file path=word/footnotes.xml><?xml version="1.0" encoding="utf-8"?>
 <w:footnotes xmlns:w="http://schemas.openxmlformats.org/wordprocessingml/2006/main">
   <w:footnote w:type="separator" w:id="-1">
@@ -32185,6 +32198,66 @@
     </w:p>
   </w:footnote>
 </w:footnotes>
+</file>
+
+<file path=word/header1.xml><?xml version="1.0" encoding="utf-8"?>
+<w:hdr xmlns:w="http://schemas.openxmlformats.org/wordprocessingml/2006/main" xmlns:r="http://schemas.openxmlformats.org/officeDocument/2006/relationships">
+  <w:p>
+    <w:pPr>
+      <w:pBdr>
+        <w:bottom w:val="single" w:sz="6" w:space="2" w:color="1F3864"/>
+      </w:pBdr>
+      <w:tabs>
+        <w:tab w:val="right" w:pos="9000"/>
+      </w:tabs>
+      <w:spacing w:after="40"/>
+      <w:rPr>
+        <w:rFonts w:ascii="Calibri" w:eastAsia="Microsoft YaHei" w:hAnsi="Calibri"/>
+        <w:color w:val="1F3864"/>
+        <w:sz w:val="18"/>
+        <w:szCs w:val="18"/>
+      </w:rPr>
+    </w:pPr>
+    <w:r>
+      <w:rPr>
+        <w:rFonts w:ascii="Calibri" w:eastAsia="Microsoft YaHei" w:hAnsi="Calibri"/>
+        <w:b/>
+        <w:color w:val="1F3864"/>
+        <w:sz w:val="18"/>
+        <w:szCs w:val="18"/>
+      </w:rPr>
+      <w:t xml:space="preserve">AI 网关技术深度</w:t>
+    </w:r>
+    <w:r>
+      <w:rPr>
+        <w:rFonts w:ascii="Calibri" w:eastAsia="Microsoft YaHei" w:hAnsi="Calibri"/>
+        <w:color w:val="595959"/>
+        <w:sz w:val="18"/>
+        <w:szCs w:val="18"/>
+      </w:rPr>
+      <w:t xml:space="preserve">  ·  从 5 个原生痛点到 4 款主流源码的逐行还原</w:t>
+    </w:r>
+    <w:r>
+      <w:rPr>
+        <w:rFonts w:ascii="Calibri" w:eastAsia="Microsoft YaHei" w:hAnsi="Calibri"/>
+        <w:color w:val="595959"/>
+        <w:sz w:val="18"/>
+        <w:szCs w:val="18"/>
+      </w:rPr>
+      <w:tab/>
+    </w:r>
+    <w:r>
+      <w:rPr>
+        <w:rFonts w:ascii="Calibri" w:eastAsia="Microsoft YaHei" w:hAnsi="Calibri"/>
+        <w:i/>
+        <w:color w:val="595959"/>
+        <w:sz w:val="18"/>
+        <w:szCs w:val="18"/>
+      </w:rPr>
+      <w:t xml:space="preserve">hermes-agent 研究系列</w:t>
+    </w:r>
+  </w:p>
+</w:hdr>
 </file>
 
 <file path=word/numbering.xml><?xml version="1.0" encoding="utf-8"?>
@@ -32212,59 +32285,92 @@
   <w:style w:type="paragraph" w:default="1" w:styleId="Normal">
     <w:name w:val="Normal"/>
     <w:qFormat/>
+    <w:pPr>
+      <w:spacing w:after="120" w:line="360" w:lineRule="auto"/>
+    </w:pPr>
+    <w:rPr>
+      <w:rFonts w:ascii="Calibri" w:eastAsia="Microsoft YaHei" w:hAnsi="Calibri"/>
+      <w:sz w:val="22"/>
+      <w:szCs w:val="22"/>
+      <w:lang w:val="en-US" w:eastAsia="zh-CN" w:bidi="ar-SA"/>
+    </w:rPr>
   </w:style>
   <w:style w:type="paragraph" w:styleId="Heading1">
     <w:name w:val="heading 1"/>
     <w:basedOn w:val="Normal"/>
     <w:next w:val="Normal"/>
+    <w:link w:val="Heading1Char"/>
+    <w:uiPriority w:val="9"/>
     <w:qFormat/>
     <w:pPr>
       <w:keepNext/>
-      <w:spacing w:before="480" w:after="240"/>
+      <w:keepLines/>
+      <w:spacing w:before="480" w:after="240" w:line="360" w:lineRule="auto"/>
+      <w:ind w:left="0" w:right="0"/>
+      <w:pBdr>
+        <w:bottom w:val="single" w:sz="12" w:space="6" w:color="1F3864"/>
+      </w:pBdr>
       <w:outlineLvl w:val="0"/>
     </w:pPr>
     <w:rPr>
-      <w:rFonts w:ascii="Microsoft YaHei" w:eastAsia="Microsoft YaHei" w:hAnsi="Microsoft YaHei"/>
+      <w:rFonts w:ascii="Calibri" w:eastAsia="Microsoft YaHei" w:hAnsi="Calibri"/>
       <w:b/>
+      <w:bCs/>
       <w:color w:val="1F3864"/>
-      <w:sz w:val="40"/>
-      <w:szCs w:val="40"/>
+      <w:sz w:val="44"/>
+      <w:szCs w:val="44"/>
     </w:rPr>
   </w:style>
   <w:style w:type="paragraph" w:styleId="Heading2">
     <w:name w:val="heading 2"/>
     <w:basedOn w:val="Normal"/>
     <w:next w:val="Normal"/>
+    <w:link w:val="Heading2Char"/>
+    <w:uiPriority w:val="9"/>
+    <w:unhideWhenUsed/>
     <w:qFormat/>
     <w:pPr>
       <w:keepNext/>
-      <w:spacing w:before="360" w:after="180"/>
+      <w:keepLines/>
+      <w:spacing w:before="320" w:after="160" w:line="360" w:lineRule="auto"/>
+      <w:ind w:left="0" w:right="0"/>
+      <w:pBdr>
+        <w:left w:val="single" w:sz="24" w:space="8" w:color="2E74B5"/>
+      </w:pBdr>
       <w:outlineLvl w:val="1"/>
     </w:pPr>
     <w:rPr>
-      <w:rFonts w:ascii="Microsoft YaHei" w:eastAsia="Microsoft YaHei" w:hAnsi="Microsoft YaHei"/>
+      <w:rFonts w:ascii="Calibri" w:eastAsia="Microsoft YaHei" w:hAnsi="Calibri"/>
       <w:b/>
+      <w:bCs/>
       <w:color w:val="2E74B5"/>
-      <w:sz w:val="32"/>
-      <w:szCs w:val="32"/>
+      <w:sz w:val="34"/>
+      <w:szCs w:val="34"/>
     </w:rPr>
   </w:style>
   <w:style w:type="paragraph" w:styleId="Heading3">
     <w:name w:val="heading 3"/>
     <w:basedOn w:val="Normal"/>
     <w:next w:val="Normal"/>
+    <w:link w:val="Heading3Char"/>
+    <w:uiPriority w:val="9"/>
+    <w:unhideWhenUsed/>
     <w:qFormat/>
     <w:pPr>
       <w:keepNext/>
-      <w:spacing w:before="280" w:after="140"/>
+      <w:keepLines/>
+      <w:spacing w:before="240" w:after="120" w:line="360" w:lineRule="auto"/>
+      <w:ind w:left="0" w:right="0"/>
+      <w:shd w:val="clear" w:color="auto" w:fill="DDEBF7"/>
       <w:outlineLvl w:val="2"/>
     </w:pPr>
     <w:rPr>
-      <w:rFonts w:ascii="Microsoft YaHei" w:eastAsia="Microsoft YaHei" w:hAnsi="Microsoft YaHei"/>
+      <w:rFonts w:ascii="Calibri" w:eastAsia="Microsoft YaHei" w:hAnsi="Calibri"/>
       <w:b/>
+      <w:bCs/>
       <w:color w:val="1F4E79"/>
-      <w:sz w:val="26"/>
-      <w:szCs w:val="26"/>
+      <w:sz w:val="28"/>
+      <w:szCs w:val="28"/>
     </w:rPr>
   </w:style>
   <w:style w:type="paragraph" w:styleId="Heading4">
@@ -32304,30 +32410,50 @@
   <w:style w:type="paragraph" w:styleId="SourceCode">
     <w:name w:val="Source Code"/>
     <w:basedOn w:val="Normal"/>
+    <w:next w:val="SourceCode"/>
+    <w:uiPriority w:val="40"/>
     <w:qFormat/>
     <w:pPr>
-      <w:spacing w:before="120" w:after="120" w:line="280" w:lineRule="auto"/>
-      <w:ind w:left="240" w:right="240"/>
-      <w:shd w:val="clear" w:color="auto" w:fill="F2F2F2"/>
+      <w:pBdr>
+        <w:top w:val="single" w:sz="4" w:space="2" w:color="BFBFBF"/>
+        <w:left w:val="single" w:sz="4" w:space="6" w:color="BFBFBF"/>
+        <w:bottom w:val="single" w:sz="4" w:space="2" w:color="BFBFBF"/>
+        <w:right w:val="single" w:sz="4" w:space="6" w:color="BFBFBF"/>
+      </w:pBdr>
+      <w:shd w:val="clear" w:color="auto" w:fill="F5F5F5"/>
+      <w:spacing w:before="40" w:after="40" w:line="280" w:lineRule="auto"/>
+      <w:ind w:left="284" w:right="284"/>
     </w:pPr>
     <w:rPr>
       <w:rFonts w:ascii="Consolas" w:eastAsia="Consolas" w:hAnsi="Consolas" w:cs="Consolas"/>
-      <w:sz w:val="18"/>
-      <w:szCs w:val="18"/>
+      <w:color w:val="262626"/>
+      <w:sz w:val="20"/>
+      <w:szCs w:val="20"/>
     </w:rPr>
   </w:style>
   <w:style w:type="paragraph" w:styleId="BlockText">
     <w:name w:val="Block Text"/>
     <w:basedOn w:val="Normal"/>
+    <w:link w:val="BlockTextChar"/>
+    <w:uiPriority w:val="99"/>
+    <w:semiHidden/>
+    <w:unhideWhenUsed/>
     <w:qFormat/>
     <w:pPr>
-      <w:spacing w:before="100" w:after="100"/>
-      <w:ind w:left="480"/>
+      <w:pBdr>
+        <w:left w:val="single" w:sz="36" w:space="10" w:color="2E74B5"/>
+      </w:pBdr>
+      <w:shd w:val="clear" w:color="auto" w:fill="EAF1FA"/>
+      <w:spacing w:before="120" w:after="120" w:line="360" w:lineRule="auto"/>
+      <w:ind w:left="360" w:right="360"/>
     </w:pPr>
     <w:rPr>
-      <w:rFonts w:ascii="Consolas" w:eastAsia="Microsoft YaHei" w:hAnsi="Consolas"/>
-      <w:sz w:val="20"/>
-      <w:szCs w:val="20"/>
+      <w:rFonts w:ascii="Calibri" w:eastAsia="Microsoft YaHei" w:hAnsi="Calibri"/>
+      <w:i/>
+      <w:iCs/>
+      <w:color w:val="1F4E79"/>
+      <w:sz w:val="22"/>
+      <w:szCs w:val="22"/>
     </w:rPr>
   </w:style>
   <w:style w:type="character" w:styleId="CodeChar">
@@ -32396,16 +32522,69 @@
   <w:style w:type="table" w:styleId="TableGrid">
     <w:name w:val="Table Grid"/>
     <w:basedOn w:val="TableNormal"/>
+    <w:uiPriority w:val="39"/>
+    <w:pPr>
+      <w:spacing w:after="0" w:line="240" w:lineRule="auto"/>
+    </w:pPr>
     <w:tblPr>
       <w:tblBorders>
-        <w:top w:val="single" w:sz="4" w:color="888888"/>
-        <w:left w:val="single" w:sz="4" w:color="888888"/>
-        <w:bottom w:val="single" w:sz="4" w:color="888888"/>
-        <w:right w:val="single" w:sz="4" w:color="888888"/>
-        <w:insideH w:val="single" w:sz="4" w:color="CCCCCC"/>
-        <w:insideV w:val="single" w:sz="4" w:color="CCCCCC"/>
+        <w:top w:val="single" w:sz="8" w:space="0" w:color="2E74B5"/>
+        <w:left w:val="single" w:sz="4" w:space="0" w:color="BFBFBF"/>
+        <w:bottom w:val="single" w:sz="8" w:space="0" w:color="2E74B5"/>
+        <w:right w:val="single" w:sz="4" w:space="0" w:color="BFBFBF"/>
+        <w:insideH w:val="single" w:sz="4" w:space="0" w:color="D9D9D9"/>
+        <w:insideV w:val="single" w:sz="4" w:space="0" w:color="D9D9D9"/>
       </w:tblBorders>
+      <w:tblCellMar>
+        <w:top w:w="60" w:type="dxa"/>
+        <w:left w:w="100" w:type="dxa"/>
+        <w:bottom w:w="60" w:type="dxa"/>
+        <w:right w:w="100" w:type="dxa"/>
+      </w:tblCellMar>
     </w:tblPr>
+    <w:tblStylePr w:type="firstRow">
+      <w:rPr>
+        <w:rFonts w:ascii="Calibri" w:eastAsia="Microsoft YaHei" w:hAnsi="Calibri"/>
+        <w:b/>
+        <w:bCs/>
+        <w:color w:val="FFFFFF"/>
+      </w:rPr>
+      <w:tblPr/>
+      <w:tcPr>
+        <w:tcBorders>
+          <w:bottom w:val="single" w:sz="8" w:space="0" w:color="1F4E79"/>
+        </w:tcBorders>
+        <w:shd w:val="clear" w:color="auto" w:fill="2E74B5"/>
+      </w:tcPr>
+    </w:tblStylePr>
+    <w:tblStylePr w:type="band1Horz">
+      <w:tcPr>
+        <w:shd w:val="clear" w:color="auto" w:fill="F2F7FC"/>
+      </w:tcPr>
+    </w:tblStylePr>
+  </w:style>
+  <w:style w:type="paragraph" w:styleId="CalloutBox">
+    <w:name w:val="Callout Box"/>
+    <w:basedOn w:val="Normal"/>
+    <w:uiPriority w:val="40"/>
+    <w:qFormat/>
+    <w:pPr>
+      <w:pBdr>
+        <w:top w:val="single" w:sz="8" w:space="4" w:color="C00000"/>
+        <w:left w:val="single" w:sz="8" w:space="4" w:color="C00000"/>
+        <w:bottom w:val="single" w:sz="8" w:space="4" w:color="C00000"/>
+        <w:right w:val="single" w:sz="8" w:space="4" w:color="C00000"/>
+      </w:pBdr>
+      <w:shd w:val="clear" w:color="auto" w:fill="FFF2CC"/>
+      <w:spacing w:before="120" w:after="120" w:line="360" w:lineRule="auto"/>
+      <w:ind w:left="284" w:right="284"/>
+    </w:pPr>
+    <w:rPr>
+      <w:rFonts w:ascii="Calibri" w:eastAsia="Microsoft YaHei" w:hAnsi="Calibri"/>
+      <w:color w:val="262626"/>
+      <w:sz w:val="22"/>
+      <w:szCs w:val="22"/>
+    </w:rPr>
   </w:style>
 </w:styles>
 </file>

</xml_diff>